<commit_message>
refactor: update documentation and remove 2024 data insertion script
</commit_message>
<xml_diff>
--- a/Melhorias.docx
+++ b/Melhorias.docx
@@ -12,6 +12,18 @@
       </w:pPr>
       <w:r>
         <w:t>Adicionar formulação de comparação entre ano atual e anterior (até o dia atual).</w:t>
+      </w:r>
+    </w:p>
+    <w:p>
+      <w:pPr>
+        <w:pStyle w:val="PargrafodaLista"/>
+        <w:numPr>
+          <w:ilvl w:val="0"/>
+          <w:numId w:val="1"/>
+        </w:numPr>
+      </w:pPr>
+      <w:r>
+        <w:t>Implantar perfect fix</w:t>
       </w:r>
     </w:p>
     <w:sectPr>

</xml_diff>